<commit_message>
Small changes to text
</commit_message>
<xml_diff>
--- a/paper_supplement.docx
+++ b/paper_supplement.docx
@@ -34,7 +34,7 @@
       <w:r>
         <w:drawing>
           <wp:inline>
-            <wp:extent cx="4620126" cy="3696101"/>
+            <wp:extent cx="5334000" cy="4445000"/>
             <wp:effectExtent b="0" l="0" r="0" t="0"/>
             <wp:docPr descr="" title="" id="21" name="Picture"/>
             <a:graphic>
@@ -55,7 +55,7 @@
                   <pic:spPr bwMode="auto">
                     <a:xfrm>
                       <a:off x="0" y="0"/>
-                      <a:ext cx="4620126" cy="3696101"/>
+                      <a:ext cx="5334000" cy="4445000"/>
                     </a:xfrm>
                     <a:prstGeom prst="rect">
                       <a:avLst/>
@@ -74,6 +74,11 @@
         </w:drawing>
       </w:r>
     </w:p>
+    <w:p>
+      <w:r>
+        <w:br w:type="page"/>
+      </w:r>
+    </w:p>
     <w:bookmarkEnd w:id="23"/>
     <w:bookmarkStart w:id="24" w:name="Xe8112d6bcb3495940b17267e42e12a40901bdfb"/>
     <w:p>
@@ -419,6 +424,35 @@
           <w:rStyle w:val="NormalTok"/>
         </w:rPr>
         <w:t xml:space="preserve"> a) </w:t>
+      </w:r>
+      <w:r>
+        <w:br/>
+      </w:r>
+      <w:r>
+        <w:rPr>
+          <w:rStyle w:val="NormalTok"/>
+        </w:rPr>
+        <w:t xml:space="preserve">turning_point</w:t>
+      </w:r>
+    </w:p>
+    <w:p>
+      <w:pPr>
+        <w:pStyle w:val="SourceCode"/>
+      </w:pPr>
+      <w:r>
+        <w:rPr>
+          <w:rStyle w:val="VerbatimChar"/>
+        </w:rPr>
+        <w:t xml:space="preserve">## current_word_length </w:t>
+      </w:r>
+      <w:r>
+        <w:br/>
+      </w:r>
+      <w:r>
+        <w:rPr>
+          <w:rStyle w:val="VerbatimChar"/>
+        </w:rPr>
+        <w:t xml:space="preserve">##            9.192402</w:t>
       </w:r>
     </w:p>
     <w:p>
@@ -457,7 +491,7 @@
         <w:gridCol w:w="2580"/>
         <w:gridCol w:w="965"/>
         <w:gridCol w:w="1015"/>
-        <w:gridCol w:w="1015"/>
+        <w:gridCol w:w="965"/>
         <w:gridCol w:w="1143"/>
       </w:tblGrid>
       <w:tr>
@@ -1012,7 +1046,7 @@
       </w:tr>
       <w:tr>
         <w:trPr>
-          <w:trHeight w:val="627" w:hRule="auto"/>
+          <w:trHeight w:val="670" w:hRule="auto"/>
         </w:trPr>
         <w:tc>
           <w:tcPr>
@@ -1064,7 +1098,7 @@
                 <w:szCs w:val="22"/>
                 <w:color w:val="000000"/>
               </w:rPr>
-              <w:t xml:space="preserve">affix</w:t>
+              <w:t xml:space="preserve">target suffix</w:t>
             </w:r>
           </w:p>
         </w:tc>
@@ -1393,169 +1427,169 @@
                 <w:szCs w:val="22"/>
                 <w:color w:val="000000"/>
               </w:rPr>
-              <w:t xml:space="preserve">0.01</w:t>
-            </w:r>
-          </w:p>
-        </w:tc>
-        <w:tc>
-          <w:tcPr>
-            <w:tcBorders>
-              <w:bottom w:val="none" w:sz="0" w:space="0" w:color="000000"/>
-              <w:top w:val="none" w:sz="0" w:space="0" w:color="000000"/>
-              <w:left w:val="none" w:sz="0" w:space="0" w:color="000000"/>
-              <w:right w:val="none" w:sz="0" w:space="0" w:color="000000"/>
-            </w:tcBorders>
-            <w:shd w:val="clear" w:color="auto" w:fill="FFFFFF"/>
-            <w:tcMar>
-              <w:top w:w="0" w:type="dxa"/>
-              <w:bottom w:w="0" w:type="dxa"/>
-              <w:left w:w="0" w:type="dxa"/>
-              <w:right w:w="0" w:type="dxa"/>
-            </w:tcMar>
-            <w:vAlign w:val="top"/>
-          </w:tcPr>
-          <w:p>
-            <w:pPr>
-              <w:jc w:val="left"/>
-              <w:pBdr>
-                <w:bottom w:val="none" w:sz="0" w:space="0" w:color="000000"/>
-                <w:top w:val="none" w:sz="0" w:space="0" w:color="000000"/>
-                <w:left w:val="none" w:sz="0" w:space="0" w:color="000000"/>
-                <w:right w:val="none" w:sz="0" w:space="0" w:color="000000"/>
-              </w:pBdr>
-              <w:spacing w:after="120" w:before="120" w:line="240"/>
-              <w:ind w:left="120" w:right="120" w:firstLine="0" w:firstLineChars="0"/>
-              <w:rPr>
-                <w:rFonts w:ascii="Arial" w:hAnsi="Arial" w:eastAsia="Arial" w:cs="Arial"/>
-                <w:i w:val="false"/>
-                <w:b w:val="false"/>
-                <w:u w:val="none"/>
-                <w:strike w:val="false"/>
-                <w:sz w:val="22"/>
-                <w:szCs w:val="22"/>
-                <w:color w:val="000000"/>
-              </w:rPr>
-            </w:pPr>
-            <w:r xmlns:w="http://schemas.openxmlformats.org/wordprocessingml/2006/main" xmlns:wp="http://schemas.openxmlformats.org/drawingml/2006/wordprocessingDrawing" xmlns:r="http://schemas.openxmlformats.org/officeDocument/2006/relationships" xmlns:w14="http://schemas.microsoft.com/office/word/2010/wordml">
-              <w:rPr>
-                <w:rFonts w:ascii="Arial" w:hAnsi="Arial" w:eastAsia="Arial" w:cs="Arial"/>
-                <w:i w:val="false"/>
-                <w:b w:val="false"/>
-                <w:u w:val="none"/>
-                <w:strike w:val="false"/>
-                <w:sz w:val="22"/>
-                <w:szCs w:val="22"/>
-                <w:color w:val="000000"/>
-              </w:rPr>
-              <w:t xml:space="preserve">0.006</w:t>
-            </w:r>
-          </w:p>
-        </w:tc>
-        <w:tc>
-          <w:tcPr>
-            <w:tcBorders>
-              <w:bottom w:val="none" w:sz="0" w:space="0" w:color="000000"/>
-              <w:top w:val="none" w:sz="0" w:space="0" w:color="000000"/>
-              <w:left w:val="none" w:sz="0" w:space="0" w:color="000000"/>
-              <w:right w:val="none" w:sz="0" w:space="0" w:color="000000"/>
-            </w:tcBorders>
-            <w:shd w:val="clear" w:color="auto" w:fill="FFFFFF"/>
-            <w:tcMar>
-              <w:top w:w="0" w:type="dxa"/>
-              <w:bottom w:w="0" w:type="dxa"/>
-              <w:left w:w="0" w:type="dxa"/>
-              <w:right w:w="0" w:type="dxa"/>
-            </w:tcMar>
-            <w:vAlign w:val="top"/>
-          </w:tcPr>
-          <w:p>
-            <w:pPr>
-              <w:jc w:val="left"/>
-              <w:pBdr>
-                <w:bottom w:val="none" w:sz="0" w:space="0" w:color="000000"/>
-                <w:top w:val="none" w:sz="0" w:space="0" w:color="000000"/>
-                <w:left w:val="none" w:sz="0" w:space="0" w:color="000000"/>
-                <w:right w:val="none" w:sz="0" w:space="0" w:color="000000"/>
-              </w:pBdr>
-              <w:spacing w:after="120" w:before="120" w:line="240"/>
-              <w:ind w:left="120" w:right="120" w:firstLine="0" w:firstLineChars="0"/>
-              <w:rPr>
-                <w:rFonts w:ascii="Arial" w:hAnsi="Arial" w:eastAsia="Arial" w:cs="Arial"/>
-                <w:i w:val="false"/>
-                <w:b w:val="false"/>
-                <w:u w:val="none"/>
-                <w:strike w:val="false"/>
-                <w:sz w:val="22"/>
-                <w:szCs w:val="22"/>
-                <w:color w:val="000000"/>
-              </w:rPr>
-            </w:pPr>
-            <w:r xmlns:w="http://schemas.openxmlformats.org/wordprocessingml/2006/main" xmlns:wp="http://schemas.openxmlformats.org/drawingml/2006/wordprocessingDrawing" xmlns:r="http://schemas.openxmlformats.org/officeDocument/2006/relationships" xmlns:w14="http://schemas.microsoft.com/office/word/2010/wordml">
-              <w:rPr>
-                <w:rFonts w:ascii="Arial" w:hAnsi="Arial" w:eastAsia="Arial" w:cs="Arial"/>
-                <w:i w:val="false"/>
-                <w:b w:val="false"/>
-                <w:u w:val="none"/>
-                <w:strike w:val="false"/>
-                <w:sz w:val="22"/>
-                <w:szCs w:val="22"/>
-                <w:color w:val="000000"/>
-              </w:rPr>
-              <w:t xml:space="preserve">0.918</w:t>
-            </w:r>
-          </w:p>
-        </w:tc>
-        <w:tc>
-          <w:tcPr>
-            <w:tcBorders>
-              <w:bottom w:val="none" w:sz="0" w:space="0" w:color="000000"/>
-              <w:top w:val="none" w:sz="0" w:space="0" w:color="000000"/>
-              <w:left w:val="none" w:sz="0" w:space="0" w:color="000000"/>
-              <w:right w:val="none" w:sz="0" w:space="0" w:color="000000"/>
-            </w:tcBorders>
-            <w:shd w:val="clear" w:color="auto" w:fill="FFFFFF"/>
-            <w:tcMar>
-              <w:top w:w="0" w:type="dxa"/>
-              <w:bottom w:w="0" w:type="dxa"/>
-              <w:left w:w="0" w:type="dxa"/>
-              <w:right w:w="0" w:type="dxa"/>
-            </w:tcMar>
-            <w:vAlign w:val="top"/>
-          </w:tcPr>
-          <w:p>
-            <w:pPr>
-              <w:jc w:val="left"/>
-              <w:pBdr>
-                <w:bottom w:val="none" w:sz="0" w:space="0" w:color="000000"/>
-                <w:top w:val="none" w:sz="0" w:space="0" w:color="000000"/>
-                <w:left w:val="none" w:sz="0" w:space="0" w:color="000000"/>
-                <w:right w:val="none" w:sz="0" w:space="0" w:color="000000"/>
-              </w:pBdr>
-              <w:spacing w:after="120" w:before="120" w:line="240"/>
-              <w:ind w:left="120" w:right="120" w:firstLine="0" w:firstLineChars="0"/>
-              <w:rPr>
-                <w:rFonts w:ascii="Arial" w:hAnsi="Arial" w:eastAsia="Arial" w:cs="Arial"/>
-                <w:i w:val="false"/>
-                <w:b w:val="false"/>
-                <w:u w:val="none"/>
-                <w:strike w:val="false"/>
-                <w:sz w:val="22"/>
-                <w:szCs w:val="22"/>
-                <w:color w:val="000000"/>
-              </w:rPr>
-            </w:pPr>
-            <w:r xmlns:w="http://schemas.openxmlformats.org/wordprocessingml/2006/main" xmlns:wp="http://schemas.openxmlformats.org/drawingml/2006/wordprocessingDrawing" xmlns:r="http://schemas.openxmlformats.org/officeDocument/2006/relationships" xmlns:w14="http://schemas.microsoft.com/office/word/2010/wordml">
-              <w:rPr>
-                <w:rFonts w:ascii="Arial" w:hAnsi="Arial" w:eastAsia="Arial" w:cs="Arial"/>
-                <w:i w:val="false"/>
-                <w:b w:val="false"/>
-                <w:u w:val="none"/>
-                <w:strike w:val="false"/>
-                <w:sz w:val="22"/>
-                <w:szCs w:val="22"/>
-                <w:color w:val="000000"/>
-              </w:rPr>
-              <w:t xml:space="preserve">0.4</w:t>
+              <w:t xml:space="preserve">-0.01</w:t>
+            </w:r>
+          </w:p>
+        </w:tc>
+        <w:tc>
+          <w:tcPr>
+            <w:tcBorders>
+              <w:bottom w:val="none" w:sz="0" w:space="0" w:color="000000"/>
+              <w:top w:val="none" w:sz="0" w:space="0" w:color="000000"/>
+              <w:left w:val="none" w:sz="0" w:space="0" w:color="000000"/>
+              <w:right w:val="none" w:sz="0" w:space="0" w:color="000000"/>
+            </w:tcBorders>
+            <w:shd w:val="clear" w:color="auto" w:fill="FFFFFF"/>
+            <w:tcMar>
+              <w:top w:w="0" w:type="dxa"/>
+              <w:bottom w:w="0" w:type="dxa"/>
+              <w:left w:w="0" w:type="dxa"/>
+              <w:right w:w="0" w:type="dxa"/>
+            </w:tcMar>
+            <w:vAlign w:val="top"/>
+          </w:tcPr>
+          <w:p>
+            <w:pPr>
+              <w:jc w:val="left"/>
+              <w:pBdr>
+                <w:bottom w:val="none" w:sz="0" w:space="0" w:color="000000"/>
+                <w:top w:val="none" w:sz="0" w:space="0" w:color="000000"/>
+                <w:left w:val="none" w:sz="0" w:space="0" w:color="000000"/>
+                <w:right w:val="none" w:sz="0" w:space="0" w:color="000000"/>
+              </w:pBdr>
+              <w:spacing w:after="120" w:before="120" w:line="240"/>
+              <w:ind w:left="120" w:right="120" w:firstLine="0" w:firstLineChars="0"/>
+              <w:rPr>
+                <w:rFonts w:ascii="Arial" w:hAnsi="Arial" w:eastAsia="Arial" w:cs="Arial"/>
+                <w:i w:val="false"/>
+                <w:b w:val="false"/>
+                <w:u w:val="none"/>
+                <w:strike w:val="false"/>
+                <w:sz w:val="22"/>
+                <w:szCs w:val="22"/>
+                <w:color w:val="000000"/>
+              </w:rPr>
+            </w:pPr>
+            <w:r xmlns:w="http://schemas.openxmlformats.org/wordprocessingml/2006/main" xmlns:wp="http://schemas.openxmlformats.org/drawingml/2006/wordprocessingDrawing" xmlns:r="http://schemas.openxmlformats.org/officeDocument/2006/relationships" xmlns:w14="http://schemas.microsoft.com/office/word/2010/wordml">
+              <w:rPr>
+                <w:rFonts w:ascii="Arial" w:hAnsi="Arial" w:eastAsia="Arial" w:cs="Arial"/>
+                <w:i w:val="false"/>
+                <w:b w:val="false"/>
+                <w:u w:val="none"/>
+                <w:strike w:val="false"/>
+                <w:sz w:val="22"/>
+                <w:szCs w:val="22"/>
+                <w:color w:val="000000"/>
+              </w:rPr>
+              <w:t xml:space="preserve">0.005</w:t>
+            </w:r>
+          </w:p>
+        </w:tc>
+        <w:tc>
+          <w:tcPr>
+            <w:tcBorders>
+              <w:bottom w:val="none" w:sz="0" w:space="0" w:color="000000"/>
+              <w:top w:val="none" w:sz="0" w:space="0" w:color="000000"/>
+              <w:left w:val="none" w:sz="0" w:space="0" w:color="000000"/>
+              <w:right w:val="none" w:sz="0" w:space="0" w:color="000000"/>
+            </w:tcBorders>
+            <w:shd w:val="clear" w:color="auto" w:fill="FFFFFF"/>
+            <w:tcMar>
+              <w:top w:w="0" w:type="dxa"/>
+              <w:bottom w:w="0" w:type="dxa"/>
+              <w:left w:w="0" w:type="dxa"/>
+              <w:right w:w="0" w:type="dxa"/>
+            </w:tcMar>
+            <w:vAlign w:val="top"/>
+          </w:tcPr>
+          <w:p>
+            <w:pPr>
+              <w:jc w:val="left"/>
+              <w:pBdr>
+                <w:bottom w:val="none" w:sz="0" w:space="0" w:color="000000"/>
+                <w:top w:val="none" w:sz="0" w:space="0" w:color="000000"/>
+                <w:left w:val="none" w:sz="0" w:space="0" w:color="000000"/>
+                <w:right w:val="none" w:sz="0" w:space="0" w:color="000000"/>
+              </w:pBdr>
+              <w:spacing w:after="120" w:before="120" w:line="240"/>
+              <w:ind w:left="120" w:right="120" w:firstLine="0" w:firstLineChars="0"/>
+              <w:rPr>
+                <w:rFonts w:ascii="Arial" w:hAnsi="Arial" w:eastAsia="Arial" w:cs="Arial"/>
+                <w:i w:val="false"/>
+                <w:b w:val="false"/>
+                <w:u w:val="none"/>
+                <w:strike w:val="false"/>
+                <w:sz w:val="22"/>
+                <w:szCs w:val="22"/>
+                <w:color w:val="000000"/>
+              </w:rPr>
+            </w:pPr>
+            <w:r xmlns:w="http://schemas.openxmlformats.org/wordprocessingml/2006/main" xmlns:wp="http://schemas.openxmlformats.org/drawingml/2006/wordprocessingDrawing" xmlns:r="http://schemas.openxmlformats.org/officeDocument/2006/relationships" xmlns:w14="http://schemas.microsoft.com/office/word/2010/wordml">
+              <w:rPr>
+                <w:rFonts w:ascii="Arial" w:hAnsi="Arial" w:eastAsia="Arial" w:cs="Arial"/>
+                <w:i w:val="false"/>
+                <w:b w:val="false"/>
+                <w:u w:val="none"/>
+                <w:strike w:val="false"/>
+                <w:sz w:val="22"/>
+                <w:szCs w:val="22"/>
+                <w:color w:val="000000"/>
+              </w:rPr>
+              <w:t xml:space="preserve">-2.32</w:t>
+            </w:r>
+          </w:p>
+        </w:tc>
+        <w:tc>
+          <w:tcPr>
+            <w:tcBorders>
+              <w:bottom w:val="none" w:sz="0" w:space="0" w:color="000000"/>
+              <w:top w:val="none" w:sz="0" w:space="0" w:color="000000"/>
+              <w:left w:val="none" w:sz="0" w:space="0" w:color="000000"/>
+              <w:right w:val="none" w:sz="0" w:space="0" w:color="000000"/>
+            </w:tcBorders>
+            <w:shd w:val="clear" w:color="auto" w:fill="FFFFFF"/>
+            <w:tcMar>
+              <w:top w:w="0" w:type="dxa"/>
+              <w:bottom w:w="0" w:type="dxa"/>
+              <w:left w:w="0" w:type="dxa"/>
+              <w:right w:w="0" w:type="dxa"/>
+            </w:tcMar>
+            <w:vAlign w:val="top"/>
+          </w:tcPr>
+          <w:p>
+            <w:pPr>
+              <w:jc w:val="left"/>
+              <w:pBdr>
+                <w:bottom w:val="none" w:sz="0" w:space="0" w:color="000000"/>
+                <w:top w:val="none" w:sz="0" w:space="0" w:color="000000"/>
+                <w:left w:val="none" w:sz="0" w:space="0" w:color="000000"/>
+                <w:right w:val="none" w:sz="0" w:space="0" w:color="000000"/>
+              </w:pBdr>
+              <w:spacing w:after="120" w:before="120" w:line="240"/>
+              <w:ind w:left="120" w:right="120" w:firstLine="0" w:firstLineChars="0"/>
+              <w:rPr>
+                <w:rFonts w:ascii="Arial" w:hAnsi="Arial" w:eastAsia="Arial" w:cs="Arial"/>
+                <w:i w:val="false"/>
+                <w:b w:val="false"/>
+                <w:u w:val="none"/>
+                <w:strike w:val="false"/>
+                <w:sz w:val="22"/>
+                <w:szCs w:val="22"/>
+                <w:color w:val="000000"/>
+              </w:rPr>
+            </w:pPr>
+            <w:r xmlns:w="http://schemas.openxmlformats.org/wordprocessingml/2006/main" xmlns:wp="http://schemas.openxmlformats.org/drawingml/2006/wordprocessingDrawing" xmlns:r="http://schemas.openxmlformats.org/officeDocument/2006/relationships" xmlns:w14="http://schemas.microsoft.com/office/word/2010/wordml">
+              <w:rPr>
+                <w:rFonts w:ascii="Arial" w:hAnsi="Arial" w:eastAsia="Arial" w:cs="Arial"/>
+                <w:i w:val="false"/>
+                <w:b w:val="false"/>
+                <w:u w:val="none"/>
+                <w:strike w:val="false"/>
+                <w:sz w:val="22"/>
+                <w:szCs w:val="22"/>
+                <w:color w:val="000000"/>
+              </w:rPr>
+              <w:t xml:space="preserve">0.020</w:t>
             </w:r>
           </w:p>
         </w:tc>
@@ -1722,61 +1756,61 @@
                 <w:szCs w:val="22"/>
                 <w:color w:val="000000"/>
               </w:rPr>
-              <w:t xml:space="preserve">0.005</w:t>
-            </w:r>
-          </w:p>
-        </w:tc>
-        <w:tc>
-          <w:tcPr>
-            <w:tcBorders>
-              <w:bottom w:val="none" w:sz="0" w:space="0" w:color="000000"/>
-              <w:top w:val="none" w:sz="0" w:space="0" w:color="000000"/>
-              <w:left w:val="none" w:sz="0" w:space="0" w:color="000000"/>
-              <w:right w:val="none" w:sz="0" w:space="0" w:color="000000"/>
-            </w:tcBorders>
-            <w:shd w:val="clear" w:color="auto" w:fill="FFFFFF"/>
-            <w:tcMar>
-              <w:top w:w="0" w:type="dxa"/>
-              <w:bottom w:w="0" w:type="dxa"/>
-              <w:left w:w="0" w:type="dxa"/>
-              <w:right w:w="0" w:type="dxa"/>
-            </w:tcMar>
-            <w:vAlign w:val="top"/>
-          </w:tcPr>
-          <w:p>
-            <w:pPr>
-              <w:jc w:val="left"/>
-              <w:pBdr>
-                <w:bottom w:val="none" w:sz="0" w:space="0" w:color="000000"/>
-                <w:top w:val="none" w:sz="0" w:space="0" w:color="000000"/>
-                <w:left w:val="none" w:sz="0" w:space="0" w:color="000000"/>
-                <w:right w:val="none" w:sz="0" w:space="0" w:color="000000"/>
-              </w:pBdr>
-              <w:spacing w:after="120" w:before="120" w:line="240"/>
-              <w:ind w:left="120" w:right="120" w:firstLine="0" w:firstLineChars="0"/>
-              <w:rPr>
-                <w:rFonts w:ascii="Arial" w:hAnsi="Arial" w:eastAsia="Arial" w:cs="Arial"/>
-                <w:i w:val="false"/>
-                <w:b w:val="false"/>
-                <w:u w:val="none"/>
-                <w:strike w:val="false"/>
-                <w:sz w:val="22"/>
-                <w:szCs w:val="22"/>
-                <w:color w:val="000000"/>
-              </w:rPr>
-            </w:pPr>
-            <w:r xmlns:w="http://schemas.openxmlformats.org/wordprocessingml/2006/main" xmlns:wp="http://schemas.openxmlformats.org/drawingml/2006/wordprocessingDrawing" xmlns:r="http://schemas.openxmlformats.org/officeDocument/2006/relationships" xmlns:w14="http://schemas.microsoft.com/office/word/2010/wordml">
-              <w:rPr>
-                <w:rFonts w:ascii="Arial" w:hAnsi="Arial" w:eastAsia="Arial" w:cs="Arial"/>
-                <w:i w:val="false"/>
-                <w:b w:val="false"/>
-                <w:u w:val="none"/>
-                <w:strike w:val="false"/>
-                <w:sz w:val="22"/>
-                <w:szCs w:val="22"/>
-                <w:color w:val="000000"/>
-              </w:rPr>
-              <w:t xml:space="preserve">-7.58</w:t>
+              <w:t xml:space="preserve">0.004</w:t>
+            </w:r>
+          </w:p>
+        </w:tc>
+        <w:tc>
+          <w:tcPr>
+            <w:tcBorders>
+              <w:bottom w:val="none" w:sz="0" w:space="0" w:color="000000"/>
+              <w:top w:val="none" w:sz="0" w:space="0" w:color="000000"/>
+              <w:left w:val="none" w:sz="0" w:space="0" w:color="000000"/>
+              <w:right w:val="none" w:sz="0" w:space="0" w:color="000000"/>
+            </w:tcBorders>
+            <w:shd w:val="clear" w:color="auto" w:fill="FFFFFF"/>
+            <w:tcMar>
+              <w:top w:w="0" w:type="dxa"/>
+              <w:bottom w:w="0" w:type="dxa"/>
+              <w:left w:w="0" w:type="dxa"/>
+              <w:right w:w="0" w:type="dxa"/>
+            </w:tcMar>
+            <w:vAlign w:val="top"/>
+          </w:tcPr>
+          <w:p>
+            <w:pPr>
+              <w:jc w:val="left"/>
+              <w:pBdr>
+                <w:bottom w:val="none" w:sz="0" w:space="0" w:color="000000"/>
+                <w:top w:val="none" w:sz="0" w:space="0" w:color="000000"/>
+                <w:left w:val="none" w:sz="0" w:space="0" w:color="000000"/>
+                <w:right w:val="none" w:sz="0" w:space="0" w:color="000000"/>
+              </w:pBdr>
+              <w:spacing w:after="120" w:before="120" w:line="240"/>
+              <w:ind w:left="120" w:right="120" w:firstLine="0" w:firstLineChars="0"/>
+              <w:rPr>
+                <w:rFonts w:ascii="Arial" w:hAnsi="Arial" w:eastAsia="Arial" w:cs="Arial"/>
+                <w:i w:val="false"/>
+                <w:b w:val="false"/>
+                <w:u w:val="none"/>
+                <w:strike w:val="false"/>
+                <w:sz w:val="22"/>
+                <w:szCs w:val="22"/>
+                <w:color w:val="000000"/>
+              </w:rPr>
+            </w:pPr>
+            <w:r xmlns:w="http://schemas.openxmlformats.org/wordprocessingml/2006/main" xmlns:wp="http://schemas.openxmlformats.org/drawingml/2006/wordprocessingDrawing" xmlns:r="http://schemas.openxmlformats.org/officeDocument/2006/relationships" xmlns:w14="http://schemas.microsoft.com/office/word/2010/wordml">
+              <w:rPr>
+                <w:rFonts w:ascii="Arial" w:hAnsi="Arial" w:eastAsia="Arial" w:cs="Arial"/>
+                <w:i w:val="false"/>
+                <w:b w:val="false"/>
+                <w:u w:val="none"/>
+                <w:strike w:val="false"/>
+                <w:sz w:val="22"/>
+                <w:szCs w:val="22"/>
+                <w:color w:val="000000"/>
+              </w:rPr>
+              <w:t xml:space="preserve">-10.2</w:t>
             </w:r>
           </w:p>
         </w:tc>
@@ -1997,61 +2031,336 @@
                 <w:szCs w:val="22"/>
                 <w:color w:val="000000"/>
               </w:rPr>
-              <w:t xml:space="preserve">0.006</w:t>
-            </w:r>
-          </w:p>
-        </w:tc>
-        <w:tc>
-          <w:tcPr>
-            <w:tcBorders>
-              <w:bottom w:val="none" w:sz="0" w:space="0" w:color="000000"/>
-              <w:top w:val="none" w:sz="0" w:space="0" w:color="000000"/>
-              <w:left w:val="none" w:sz="0" w:space="0" w:color="000000"/>
-              <w:right w:val="none" w:sz="0" w:space="0" w:color="000000"/>
-            </w:tcBorders>
-            <w:shd w:val="clear" w:color="auto" w:fill="FFFFFF"/>
-            <w:tcMar>
-              <w:top w:w="0" w:type="dxa"/>
-              <w:bottom w:w="0" w:type="dxa"/>
-              <w:left w:w="0" w:type="dxa"/>
-              <w:right w:w="0" w:type="dxa"/>
-            </w:tcMar>
-            <w:vAlign w:val="top"/>
-          </w:tcPr>
-          <w:p>
-            <w:pPr>
-              <w:jc w:val="left"/>
-              <w:pBdr>
-                <w:bottom w:val="none" w:sz="0" w:space="0" w:color="000000"/>
-                <w:top w:val="none" w:sz="0" w:space="0" w:color="000000"/>
-                <w:left w:val="none" w:sz="0" w:space="0" w:color="000000"/>
-                <w:right w:val="none" w:sz="0" w:space="0" w:color="000000"/>
-              </w:pBdr>
-              <w:spacing w:after="120" w:before="120" w:line="240"/>
-              <w:ind w:left="120" w:right="120" w:firstLine="0" w:firstLineChars="0"/>
-              <w:rPr>
-                <w:rFonts w:ascii="Arial" w:hAnsi="Arial" w:eastAsia="Arial" w:cs="Arial"/>
-                <w:i w:val="false"/>
-                <w:b w:val="false"/>
-                <w:u w:val="none"/>
-                <w:strike w:val="false"/>
-                <w:sz w:val="22"/>
-                <w:szCs w:val="22"/>
-                <w:color w:val="000000"/>
-              </w:rPr>
-            </w:pPr>
-            <w:r xmlns:w="http://schemas.openxmlformats.org/wordprocessingml/2006/main" xmlns:wp="http://schemas.openxmlformats.org/drawingml/2006/wordprocessingDrawing" xmlns:r="http://schemas.openxmlformats.org/officeDocument/2006/relationships" xmlns:w14="http://schemas.microsoft.com/office/word/2010/wordml">
-              <w:rPr>
-                <w:rFonts w:ascii="Arial" w:hAnsi="Arial" w:eastAsia="Arial" w:cs="Arial"/>
-                <w:i w:val="false"/>
-                <w:b w:val="false"/>
-                <w:u w:val="none"/>
-                <w:strike w:val="false"/>
-                <w:sz w:val="22"/>
-                <w:szCs w:val="22"/>
-                <w:color w:val="000000"/>
-              </w:rPr>
-              <w:t xml:space="preserve">-21.4</w:t>
+              <w:t xml:space="preserve">0.005</w:t>
+            </w:r>
+          </w:p>
+        </w:tc>
+        <w:tc>
+          <w:tcPr>
+            <w:tcBorders>
+              <w:bottom w:val="none" w:sz="0" w:space="0" w:color="000000"/>
+              <w:top w:val="none" w:sz="0" w:space="0" w:color="000000"/>
+              <w:left w:val="none" w:sz="0" w:space="0" w:color="000000"/>
+              <w:right w:val="none" w:sz="0" w:space="0" w:color="000000"/>
+            </w:tcBorders>
+            <w:shd w:val="clear" w:color="auto" w:fill="FFFFFF"/>
+            <w:tcMar>
+              <w:top w:w="0" w:type="dxa"/>
+              <w:bottom w:w="0" w:type="dxa"/>
+              <w:left w:w="0" w:type="dxa"/>
+              <w:right w:w="0" w:type="dxa"/>
+            </w:tcMar>
+            <w:vAlign w:val="top"/>
+          </w:tcPr>
+          <w:p>
+            <w:pPr>
+              <w:jc w:val="left"/>
+              <w:pBdr>
+                <w:bottom w:val="none" w:sz="0" w:space="0" w:color="000000"/>
+                <w:top w:val="none" w:sz="0" w:space="0" w:color="000000"/>
+                <w:left w:val="none" w:sz="0" w:space="0" w:color="000000"/>
+                <w:right w:val="none" w:sz="0" w:space="0" w:color="000000"/>
+              </w:pBdr>
+              <w:spacing w:after="120" w:before="120" w:line="240"/>
+              <w:ind w:left="120" w:right="120" w:firstLine="0" w:firstLineChars="0"/>
+              <w:rPr>
+                <w:rFonts w:ascii="Arial" w:hAnsi="Arial" w:eastAsia="Arial" w:cs="Arial"/>
+                <w:i w:val="false"/>
+                <w:b w:val="false"/>
+                <w:u w:val="none"/>
+                <w:strike w:val="false"/>
+                <w:sz w:val="22"/>
+                <w:szCs w:val="22"/>
+                <w:color w:val="000000"/>
+              </w:rPr>
+            </w:pPr>
+            <w:r xmlns:w="http://schemas.openxmlformats.org/wordprocessingml/2006/main" xmlns:wp="http://schemas.openxmlformats.org/drawingml/2006/wordprocessingDrawing" xmlns:r="http://schemas.openxmlformats.org/officeDocument/2006/relationships" xmlns:w14="http://schemas.microsoft.com/office/word/2010/wordml">
+              <w:rPr>
+                <w:rFonts w:ascii="Arial" w:hAnsi="Arial" w:eastAsia="Arial" w:cs="Arial"/>
+                <w:i w:val="false"/>
+                <w:b w:val="false"/>
+                <w:u w:val="none"/>
+                <w:strike w:val="false"/>
+                <w:sz w:val="22"/>
+                <w:szCs w:val="22"/>
+                <w:color w:val="000000"/>
+              </w:rPr>
+              <w:t xml:space="preserve">-23.8</w:t>
+            </w:r>
+          </w:p>
+        </w:tc>
+        <w:tc>
+          <w:tcPr>
+            <w:tcBorders>
+              <w:bottom w:val="none" w:sz="0" w:space="0" w:color="000000"/>
+              <w:top w:val="none" w:sz="0" w:space="0" w:color="000000"/>
+              <w:left w:val="none" w:sz="0" w:space="0" w:color="000000"/>
+              <w:right w:val="none" w:sz="0" w:space="0" w:color="000000"/>
+            </w:tcBorders>
+            <w:shd w:val="clear" w:color="auto" w:fill="FFFFFF"/>
+            <w:tcMar>
+              <w:top w:w="0" w:type="dxa"/>
+              <w:bottom w:w="0" w:type="dxa"/>
+              <w:left w:w="0" w:type="dxa"/>
+              <w:right w:w="0" w:type="dxa"/>
+            </w:tcMar>
+            <w:vAlign w:val="top"/>
+          </w:tcPr>
+          <w:p>
+            <w:pPr>
+              <w:jc w:val="left"/>
+              <w:pBdr>
+                <w:bottom w:val="none" w:sz="0" w:space="0" w:color="000000"/>
+                <w:top w:val="none" w:sz="0" w:space="0" w:color="000000"/>
+                <w:left w:val="none" w:sz="0" w:space="0" w:color="000000"/>
+                <w:right w:val="none" w:sz="0" w:space="0" w:color="000000"/>
+              </w:pBdr>
+              <w:spacing w:after="120" w:before="120" w:line="240"/>
+              <w:ind w:left="120" w:right="120" w:firstLine="0" w:firstLineChars="0"/>
+              <w:rPr>
+                <w:rFonts w:ascii="Arial" w:hAnsi="Arial" w:eastAsia="Arial" w:cs="Arial"/>
+                <w:i w:val="false"/>
+                <w:b w:val="false"/>
+                <w:u w:val="none"/>
+                <w:strike w:val="false"/>
+                <w:sz w:val="22"/>
+                <w:szCs w:val="22"/>
+                <w:color w:val="000000"/>
+              </w:rPr>
+            </w:pPr>
+            <w:r xmlns:w="http://schemas.openxmlformats.org/wordprocessingml/2006/main" xmlns:wp="http://schemas.openxmlformats.org/drawingml/2006/wordprocessingDrawing" xmlns:r="http://schemas.openxmlformats.org/officeDocument/2006/relationships" xmlns:w14="http://schemas.microsoft.com/office/word/2010/wordml">
+              <w:rPr>
+                <w:rFonts w:ascii="Arial" w:hAnsi="Arial" w:eastAsia="Arial" w:cs="Arial"/>
+                <w:i w:val="false"/>
+                <w:b w:val="false"/>
+                <w:u w:val="none"/>
+                <w:strike w:val="false"/>
+                <w:sz w:val="22"/>
+                <w:szCs w:val="22"/>
+                <w:color w:val="000000"/>
+              </w:rPr>
+              <w:t xml:space="preserve">&lt;0.001</w:t>
+            </w:r>
+          </w:p>
+        </w:tc>
+      </w:tr>
+      <w:tr>
+        <w:trPr>
+          <w:trHeight w:val="625" w:hRule="auto"/>
+        </w:trPr>
+        <w:tc>
+          <w:tcPr>
+            <w:tcBorders>
+              <w:bottom w:val="none" w:sz="0" w:space="0" w:color="000000"/>
+              <w:top w:val="none" w:sz="0" w:space="0" w:color="000000"/>
+              <w:left w:val="none" w:sz="0" w:space="0" w:color="000000"/>
+              <w:right w:val="none" w:sz="0" w:space="0" w:color="000000"/>
+            </w:tcBorders>
+            <w:shd w:val="clear" w:color="auto" w:fill="FFFFFF"/>
+            <w:tcMar>
+              <w:top w:w="0" w:type="dxa"/>
+              <w:bottom w:w="0" w:type="dxa"/>
+              <w:left w:w="0" w:type="dxa"/>
+              <w:right w:w="0" w:type="dxa"/>
+            </w:tcMar>
+            <w:vAlign w:val="top"/>
+          </w:tcPr>
+          <w:p>
+            <w:pPr>
+              <w:jc w:val="left"/>
+              <w:pBdr>
+                <w:bottom w:val="none" w:sz="0" w:space="0" w:color="000000"/>
+                <w:top w:val="none" w:sz="0" w:space="0" w:color="000000"/>
+                <w:left w:val="none" w:sz="0" w:space="0" w:color="000000"/>
+                <w:right w:val="none" w:sz="0" w:space="0" w:color="000000"/>
+              </w:pBdr>
+              <w:spacing w:after="120" w:before="120" w:line="240"/>
+              <w:ind w:left="120" w:right="120" w:firstLine="0" w:firstLineChars="0"/>
+              <w:rPr>
+                <w:rFonts w:ascii="Arial" w:hAnsi="Arial" w:eastAsia="Arial" w:cs="Arial"/>
+                <w:i w:val="false"/>
+                <w:b w:val="false"/>
+                <w:u w:val="none"/>
+                <w:strike w:val="false"/>
+                <w:sz w:val="22"/>
+                <w:szCs w:val="22"/>
+                <w:color w:val="000000"/>
+              </w:rPr>
+            </w:pPr>
+            <w:r xmlns:w="http://schemas.openxmlformats.org/wordprocessingml/2006/main" xmlns:wp="http://schemas.openxmlformats.org/drawingml/2006/wordprocessingDrawing" xmlns:r="http://schemas.openxmlformats.org/officeDocument/2006/relationships" xmlns:w14="http://schemas.microsoft.com/office/word/2010/wordml">
+              <w:rPr>
+                <w:rFonts w:ascii="Arial" w:hAnsi="Arial" w:eastAsia="Arial" w:cs="Arial"/>
+                <w:i w:val="false"/>
+                <w:b w:val="false"/>
+                <w:u w:val="none"/>
+                <w:strike w:val="false"/>
+                <w:sz w:val="22"/>
+                <w:szCs w:val="22"/>
+                <w:color w:val="000000"/>
+              </w:rPr>
+              <w:t xml:space="preserve">baseline word</w:t>
+            </w:r>
+          </w:p>
+        </w:tc>
+        <w:tc>
+          <w:tcPr>
+            <w:tcBorders>
+              <w:bottom w:val="none" w:sz="0" w:space="0" w:color="000000"/>
+              <w:top w:val="none" w:sz="0" w:space="0" w:color="000000"/>
+              <w:left w:val="none" w:sz="0" w:space="0" w:color="000000"/>
+              <w:right w:val="none" w:sz="0" w:space="0" w:color="000000"/>
+            </w:tcBorders>
+            <w:shd w:val="clear" w:color="auto" w:fill="FFFFFF"/>
+            <w:tcMar>
+              <w:top w:w="0" w:type="dxa"/>
+              <w:bottom w:w="0" w:type="dxa"/>
+              <w:left w:w="0" w:type="dxa"/>
+              <w:right w:w="0" w:type="dxa"/>
+            </w:tcMar>
+            <w:vAlign w:val="top"/>
+          </w:tcPr>
+          <w:p>
+            <w:pPr>
+              <w:jc w:val="left"/>
+              <w:pBdr>
+                <w:bottom w:val="none" w:sz="0" w:space="0" w:color="000000"/>
+                <w:top w:val="none" w:sz="0" w:space="0" w:color="000000"/>
+                <w:left w:val="none" w:sz="0" w:space="0" w:color="000000"/>
+                <w:right w:val="none" w:sz="0" w:space="0" w:color="000000"/>
+              </w:pBdr>
+              <w:spacing w:after="120" w:before="120" w:line="240"/>
+              <w:ind w:left="120" w:right="120" w:firstLine="0" w:firstLineChars="0"/>
+              <w:rPr>
+                <w:rFonts w:ascii="Arial" w:hAnsi="Arial" w:eastAsia="Arial" w:cs="Arial"/>
+                <w:i w:val="false"/>
+                <w:b w:val="false"/>
+                <w:u w:val="none"/>
+                <w:strike w:val="false"/>
+                <w:sz w:val="22"/>
+                <w:szCs w:val="22"/>
+                <w:color w:val="000000"/>
+              </w:rPr>
+            </w:pPr>
+            <w:r xmlns:w="http://schemas.openxmlformats.org/wordprocessingml/2006/main" xmlns:wp="http://schemas.openxmlformats.org/drawingml/2006/wordprocessingDrawing" xmlns:r="http://schemas.openxmlformats.org/officeDocument/2006/relationships" xmlns:w14="http://schemas.microsoft.com/office/word/2010/wordml">
+              <w:rPr>
+                <w:rFonts w:ascii="Arial" w:hAnsi="Arial" w:eastAsia="Arial" w:cs="Arial"/>
+                <w:i w:val="false"/>
+                <w:b w:val="false"/>
+                <w:u w:val="none"/>
+                <w:strike w:val="false"/>
+                <w:sz w:val="22"/>
+                <w:szCs w:val="22"/>
+                <w:color w:val="000000"/>
+              </w:rPr>
+              <w:t xml:space="preserve">-0.13</w:t>
+            </w:r>
+          </w:p>
+        </w:tc>
+        <w:tc>
+          <w:tcPr>
+            <w:tcBorders>
+              <w:bottom w:val="none" w:sz="0" w:space="0" w:color="000000"/>
+              <w:top w:val="none" w:sz="0" w:space="0" w:color="000000"/>
+              <w:left w:val="none" w:sz="0" w:space="0" w:color="000000"/>
+              <w:right w:val="none" w:sz="0" w:space="0" w:color="000000"/>
+            </w:tcBorders>
+            <w:shd w:val="clear" w:color="auto" w:fill="FFFFFF"/>
+            <w:tcMar>
+              <w:top w:w="0" w:type="dxa"/>
+              <w:bottom w:w="0" w:type="dxa"/>
+              <w:left w:w="0" w:type="dxa"/>
+              <w:right w:w="0" w:type="dxa"/>
+            </w:tcMar>
+            <w:vAlign w:val="top"/>
+          </w:tcPr>
+          <w:p>
+            <w:pPr>
+              <w:jc w:val="left"/>
+              <w:pBdr>
+                <w:bottom w:val="none" w:sz="0" w:space="0" w:color="000000"/>
+                <w:top w:val="none" w:sz="0" w:space="0" w:color="000000"/>
+                <w:left w:val="none" w:sz="0" w:space="0" w:color="000000"/>
+                <w:right w:val="none" w:sz="0" w:space="0" w:color="000000"/>
+              </w:pBdr>
+              <w:spacing w:after="120" w:before="120" w:line="240"/>
+              <w:ind w:left="120" w:right="120" w:firstLine="0" w:firstLineChars="0"/>
+              <w:rPr>
+                <w:rFonts w:ascii="Arial" w:hAnsi="Arial" w:eastAsia="Arial" w:cs="Arial"/>
+                <w:i w:val="false"/>
+                <w:b w:val="false"/>
+                <w:u w:val="none"/>
+                <w:strike w:val="false"/>
+                <w:sz w:val="22"/>
+                <w:szCs w:val="22"/>
+                <w:color w:val="000000"/>
+              </w:rPr>
+            </w:pPr>
+            <w:r xmlns:w="http://schemas.openxmlformats.org/wordprocessingml/2006/main" xmlns:wp="http://schemas.openxmlformats.org/drawingml/2006/wordprocessingDrawing" xmlns:r="http://schemas.openxmlformats.org/officeDocument/2006/relationships" xmlns:w14="http://schemas.microsoft.com/office/word/2010/wordml">
+              <w:rPr>
+                <w:rFonts w:ascii="Arial" w:hAnsi="Arial" w:eastAsia="Arial" w:cs="Arial"/>
+                <w:i w:val="false"/>
+                <w:b w:val="false"/>
+                <w:u w:val="none"/>
+                <w:strike w:val="false"/>
+                <w:sz w:val="22"/>
+                <w:szCs w:val="22"/>
+                <w:color w:val="000000"/>
+              </w:rPr>
+              <w:t xml:space="preserve">0.004</w:t>
+            </w:r>
+          </w:p>
+        </w:tc>
+        <w:tc>
+          <w:tcPr>
+            <w:tcBorders>
+              <w:bottom w:val="none" w:sz="0" w:space="0" w:color="000000"/>
+              <w:top w:val="none" w:sz="0" w:space="0" w:color="000000"/>
+              <w:left w:val="none" w:sz="0" w:space="0" w:color="000000"/>
+              <w:right w:val="none" w:sz="0" w:space="0" w:color="000000"/>
+            </w:tcBorders>
+            <w:shd w:val="clear" w:color="auto" w:fill="FFFFFF"/>
+            <w:tcMar>
+              <w:top w:w="0" w:type="dxa"/>
+              <w:bottom w:w="0" w:type="dxa"/>
+              <w:left w:w="0" w:type="dxa"/>
+              <w:right w:w="0" w:type="dxa"/>
+            </w:tcMar>
+            <w:vAlign w:val="top"/>
+          </w:tcPr>
+          <w:p>
+            <w:pPr>
+              <w:jc w:val="left"/>
+              <w:pBdr>
+                <w:bottom w:val="none" w:sz="0" w:space="0" w:color="000000"/>
+                <w:top w:val="none" w:sz="0" w:space="0" w:color="000000"/>
+                <w:left w:val="none" w:sz="0" w:space="0" w:color="000000"/>
+                <w:right w:val="none" w:sz="0" w:space="0" w:color="000000"/>
+              </w:pBdr>
+              <w:spacing w:after="120" w:before="120" w:line="240"/>
+              <w:ind w:left="120" w:right="120" w:firstLine="0" w:firstLineChars="0"/>
+              <w:rPr>
+                <w:rFonts w:ascii="Arial" w:hAnsi="Arial" w:eastAsia="Arial" w:cs="Arial"/>
+                <w:i w:val="false"/>
+                <w:b w:val="false"/>
+                <w:u w:val="none"/>
+                <w:strike w:val="false"/>
+                <w:sz w:val="22"/>
+                <w:szCs w:val="22"/>
+                <w:color w:val="000000"/>
+              </w:rPr>
+            </w:pPr>
+            <w:r xmlns:w="http://schemas.openxmlformats.org/wordprocessingml/2006/main" xmlns:wp="http://schemas.openxmlformats.org/drawingml/2006/wordprocessingDrawing" xmlns:r="http://schemas.openxmlformats.org/officeDocument/2006/relationships" xmlns:w14="http://schemas.microsoft.com/office/word/2010/wordml">
+              <w:rPr>
+                <w:rFonts w:ascii="Arial" w:hAnsi="Arial" w:eastAsia="Arial" w:cs="Arial"/>
+                <w:i w:val="false"/>
+                <w:b w:val="false"/>
+                <w:u w:val="none"/>
+                <w:strike w:val="false"/>
+                <w:sz w:val="22"/>
+                <w:szCs w:val="22"/>
+                <w:color w:val="000000"/>
+              </w:rPr>
+              <w:t xml:space="preserve">-31.3</w:t>
             </w:r>
           </w:p>
         </w:tc>
@@ -2218,7 +2527,7 @@
                 <w:szCs w:val="22"/>
                 <w:color w:val="000000"/>
               </w:rPr>
-              <w:t xml:space="preserve">-0.03</w:t>
+              <w:t xml:space="preserve">-0.02</w:t>
             </w:r>
           </w:p>
         </w:tc>
@@ -2326,7 +2635,7 @@
                 <w:szCs w:val="22"/>
                 <w:color w:val="000000"/>
               </w:rPr>
-              <w:t xml:space="preserve">-16.5</w:t>
+              <w:t xml:space="preserve">-15.1</w:t>
             </w:r>
           </w:p>
         </w:tc>
@@ -2493,7 +2802,7 @@
                 <w:szCs w:val="22"/>
                 <w:color w:val="000000"/>
               </w:rPr>
-              <w:t xml:space="preserve">-0.02</w:t>
+              <w:t xml:space="preserve">-0.01</w:t>
             </w:r>
           </w:p>
         </w:tc>
@@ -2601,7 +2910,7 @@
                 <w:szCs w:val="22"/>
                 <w:color w:val="000000"/>
               </w:rPr>
-              <w:t xml:space="preserve">-17.6</w:t>
+              <w:t xml:space="preserve">-20.2</w:t>
             </w:r>
           </w:p>
         </w:tc>

</xml_diff>